<commit_message>
feat: portfolio overhaul with smart contracts and role-based resumes
</commit_message>
<xml_diff>
--- a/ResumeWeb3.docx
+++ b/ResumeWeb3.docx
@@ -118,51 +118,24 @@
           <w:t>Portfolio</w:t>
         </w:r>
       </w:hyperlink>
-      <w:r>
-        <w:fldChar w:fldCharType="begin"/>
-      </w:r>
-      <w:r>
-        <w:instrText>HYPERLINK "http://kartikeynamdev.netlify.app/" \h</w:instrText>
-      </w:r>
-      <w:r>
-        <w:fldChar w:fldCharType="separate"/>
-      </w:r>
-      <w:r>
-        <w:rPr>
-          <w:color w:val="0000FF"/>
-          <w:sz w:val="18"/>
-        </w:rPr>
-        <w:t xml:space="preserve"> </w:t>
-      </w:r>
-      <w:r>
-        <w:rPr>
-          <w:color w:val="0000FF"/>
-          <w:sz w:val="18"/>
-        </w:rPr>
-        <w:fldChar w:fldCharType="end"/>
-      </w:r>
-      <w:r>
-        <w:fldChar w:fldCharType="begin"/>
-      </w:r>
-      <w:r>
-        <w:instrText>HYPERLINK "https://x.com/_KartikeyNamdev" \h</w:instrText>
-      </w:r>
-      <w:r>
-        <w:fldChar w:fldCharType="separate"/>
-      </w:r>
-      <w:r>
-        <w:rPr>
-          <w:sz w:val="18"/>
-        </w:rPr>
-        <w:t xml:space="preserve">| </w:t>
-      </w:r>
-      <w:r>
-        <w:rPr>
-          <w:sz w:val="18"/>
-        </w:rPr>
-        <w:fldChar w:fldCharType="end"/>
-      </w:r>
       <w:hyperlink r:id="rId10">
+        <w:r>
+          <w:rPr>
+            <w:color w:val="0000FF"/>
+            <w:sz w:val="18"/>
+          </w:rPr>
+          <w:t xml:space="preserve"> </w:t>
+        </w:r>
+      </w:hyperlink>
+      <w:hyperlink r:id="rId11">
+        <w:r>
+          <w:rPr>
+            <w:sz w:val="18"/>
+          </w:rPr>
+          <w:t xml:space="preserve">| </w:t>
+        </w:r>
+      </w:hyperlink>
+      <w:hyperlink r:id="rId12">
         <w:r>
           <w:rPr>
             <w:color w:val="0000FF"/>
@@ -172,7 +145,7 @@
           <w:t>Twitter</w:t>
         </w:r>
       </w:hyperlink>
-      <w:hyperlink r:id="rId11">
+      <w:hyperlink r:id="rId13">
         <w:r>
           <w:rPr>
             <w:color w:val="0000FF"/>
@@ -181,7 +154,7 @@
           <w:t xml:space="preserve"> </w:t>
         </w:r>
       </w:hyperlink>
-      <w:hyperlink r:id="rId12">
+      <w:hyperlink r:id="rId14">
         <w:r>
           <w:rPr>
             <w:sz w:val="18"/>
@@ -189,7 +162,7 @@
           <w:t xml:space="preserve">| </w:t>
         </w:r>
       </w:hyperlink>
-      <w:hyperlink r:id="rId13">
+      <w:hyperlink r:id="rId15">
         <w:proofErr w:type="spellStart"/>
         <w:r>
           <w:rPr>
@@ -201,7 +174,7 @@
         </w:r>
         <w:proofErr w:type="spellEnd"/>
       </w:hyperlink>
-      <w:hyperlink r:id="rId14">
+      <w:hyperlink r:id="rId16">
         <w:r>
           <w:rPr>
             <w:sz w:val="18"/>
@@ -1085,14 +1058,7 @@
           <w:sz w:val="22"/>
           <w:szCs w:val="22"/>
         </w:rPr>
-        <w:t>React</w:t>
-      </w:r>
-      <w:r>
-        <w:rPr>
-          <w:sz w:val="22"/>
-          <w:szCs w:val="22"/>
-        </w:rPr>
-        <w:t xml:space="preserve">, </w:t>
+        <w:t xml:space="preserve">React, </w:t>
       </w:r>
       <w:r>
         <w:rPr>
@@ -1237,28 +1203,7 @@
           <w:sz w:val="22"/>
           <w:szCs w:val="22"/>
         </w:rPr>
-        <w:t>,</w:t>
-      </w:r>
-      <w:r>
-        <w:rPr>
-          <w:sz w:val="22"/>
-          <w:szCs w:val="22"/>
-        </w:rPr>
-        <w:t xml:space="preserve"> Prometheus, Grafana, </w:t>
-      </w:r>
-      <w:r>
-        <w:rPr>
-          <w:sz w:val="22"/>
-          <w:szCs w:val="22"/>
-        </w:rPr>
-        <w:t>Kafka</w:t>
-      </w:r>
-      <w:r>
-        <w:rPr>
-          <w:sz w:val="22"/>
-          <w:szCs w:val="22"/>
-        </w:rPr>
-        <w:t xml:space="preserve"> </w:t>
+        <w:t xml:space="preserve">, Prometheus, Grafana, Kafka </w:t>
       </w:r>
     </w:p>
     <w:p>
@@ -1427,7 +1372,7 @@
         </w:rPr>
         <w:t xml:space="preserve"> (In Progress) – Matching Engine &amp; Trading System | </w:t>
       </w:r>
-      <w:hyperlink r:id="rId15" w:history="1">
+      <w:hyperlink r:id="rId17" w:history="1">
         <w:r>
           <w:rPr>
             <w:rStyle w:val="Hyperlink"/>
@@ -1439,7 +1384,7 @@
           <w:t>https://github.com/KartikeyNamdev/Exchange</w:t>
         </w:r>
       </w:hyperlink>
-      <w:hyperlink r:id="rId16">
+      <w:hyperlink r:id="rId18">
         <w:r>
           <w:rPr>
             <w:b/>
@@ -1535,126 +1480,50 @@
     <w:p>
       <w:pPr>
         <w:spacing w:line="360" w:lineRule="auto"/>
-        <w:ind w:right="76" w:firstLine="465"/>
+        <w:ind w:left="465"/>
+        <w:rPr>
+          <w:b/>
+          <w:bCs/>
+          <w:color w:val="000000"/>
+        </w:rPr>
       </w:pPr>
       <w:r>
         <w:rPr>
           <w:b/>
           <w:u w:val="single" w:color="000000"/>
         </w:rPr>
-        <w:t>Merchant Paytm</w:t>
-      </w:r>
-      <w:r>
-        <w:rPr>
-          <w:b/>
-        </w:rPr>
-        <w:t xml:space="preserve"> – Full Stack Digital Wallet</w:t>
-      </w:r>
-      <w:r>
-        <w:rPr>
-          <w:b/>
-          <w:sz w:val="37"/>
-          <w:vertAlign w:val="superscript"/>
+        <w:t>SOLVAULT</w:t>
+      </w:r>
+      <w:r>
+        <w:rPr>
+          <w:b/>
+          <w:bCs/>
+          <w:color w:val="000000"/>
         </w:rPr>
         <w:t xml:space="preserve"> </w:t>
       </w:r>
       <w:r>
         <w:rPr>
-          <w:sz w:val="32"/>
-        </w:rPr>
-        <w:t>|</w:t>
-      </w:r>
-      <w:hyperlink r:id="rId17">
-        <w:r>
-          <w:rPr>
-            <w:rStyle w:val="Hyperlink"/>
-            <w:rFonts w:asciiTheme="majorHAnsi" w:eastAsiaTheme="majorEastAsia" w:hAnsiTheme="majorHAnsi" w:cstheme="majorBidi"/>
-            <w:b/>
-            <w:bCs/>
-            <w:sz w:val="21"/>
-            <w:szCs w:val="21"/>
-          </w:rPr>
-          <w:t xml:space="preserve"> </w:t>
-        </w:r>
-      </w:hyperlink>
-      <w:hyperlink r:id="rId18">
-        <w:r>
-          <w:rPr>
-            <w:rStyle w:val="Hyperlink"/>
-            <w:rFonts w:asciiTheme="majorHAnsi" w:eastAsiaTheme="majorEastAsia" w:hAnsiTheme="majorHAnsi" w:cstheme="majorBidi"/>
-            <w:b/>
-            <w:bCs/>
-            <w:sz w:val="21"/>
-            <w:szCs w:val="21"/>
-          </w:rPr>
-          <w:t>https://roaring</w:t>
-        </w:r>
-      </w:hyperlink>
-      <w:hyperlink r:id="rId19">
-        <w:r>
-          <w:rPr>
-            <w:rStyle w:val="Hyperlink"/>
-            <w:rFonts w:asciiTheme="majorHAnsi" w:eastAsiaTheme="majorEastAsia" w:hAnsiTheme="majorHAnsi" w:cstheme="majorBidi"/>
-            <w:b/>
-            <w:bCs/>
-            <w:sz w:val="21"/>
-            <w:szCs w:val="21"/>
-          </w:rPr>
-          <w:t>-</w:t>
-        </w:r>
-      </w:hyperlink>
-      <w:hyperlink r:id="rId20">
-        <w:r>
-          <w:rPr>
-            <w:rStyle w:val="Hyperlink"/>
-            <w:rFonts w:asciiTheme="majorHAnsi" w:eastAsiaTheme="majorEastAsia" w:hAnsiTheme="majorHAnsi" w:cstheme="majorBidi"/>
-            <w:b/>
-            <w:bCs/>
-            <w:sz w:val="21"/>
-            <w:szCs w:val="21"/>
-          </w:rPr>
-          <w:t>starship</w:t>
-        </w:r>
-      </w:hyperlink>
-      <w:hyperlink r:id="rId21">
-        <w:r>
-          <w:rPr>
-            <w:rStyle w:val="Hyperlink"/>
-            <w:rFonts w:asciiTheme="majorHAnsi" w:eastAsiaTheme="majorEastAsia" w:hAnsiTheme="majorHAnsi" w:cstheme="majorBidi"/>
-            <w:b/>
-            <w:bCs/>
-            <w:sz w:val="21"/>
-            <w:szCs w:val="21"/>
-          </w:rPr>
-          <w:t>-</w:t>
-        </w:r>
-      </w:hyperlink>
-      <w:hyperlink r:id="rId22">
-        <w:r>
-          <w:rPr>
-            <w:rStyle w:val="Hyperlink"/>
-            <w:rFonts w:asciiTheme="majorHAnsi" w:eastAsiaTheme="majorEastAsia" w:hAnsiTheme="majorHAnsi" w:cstheme="majorBidi"/>
-            <w:b/>
-            <w:bCs/>
-            <w:sz w:val="21"/>
-            <w:szCs w:val="21"/>
-          </w:rPr>
-          <w:t>fbf52b.netlify.app/</w:t>
-        </w:r>
-      </w:hyperlink>
-      <w:hyperlink r:id="rId23">
-        <w:r>
-          <w:t xml:space="preserve"> </w:t>
-        </w:r>
-      </w:hyperlink>
-      <w:r>
-        <w:t xml:space="preserve">| </w:t>
+          <w:b/>
+          <w:bCs/>
+          <w:color w:val="000000"/>
+        </w:rPr>
+        <w:t xml:space="preserve">— Solana Developer Toolbox | </w:t>
+      </w:r>
+      <w:r>
+        <w:rPr>
+          <w:rStyle w:val="Hyperlink"/>
+          <w:rFonts w:asciiTheme="majorHAnsi" w:eastAsiaTheme="majorEastAsia" w:hAnsiTheme="majorHAnsi" w:cstheme="majorBidi"/>
+          <w:sz w:val="21"/>
+          <w:szCs w:val="21"/>
+        </w:rPr>
+        <w:t>https://staking-escrow-fe.vercel.app/</w:t>
       </w:r>
     </w:p>
     <w:p>
       <w:pPr>
         <w:spacing w:line="360" w:lineRule="auto"/>
-        <w:ind w:left="475"/>
+        <w:ind w:left="465"/>
         <w:rPr>
           <w:i/>
           <w:sz w:val="22"/>
@@ -1667,23 +1536,7 @@
           <w:sz w:val="22"/>
           <w:szCs w:val="22"/>
         </w:rPr>
-        <w:t>Node.js, Next.js, TypeScript, PostgreSQL, Prisma, Turbo</w:t>
-      </w:r>
-      <w:r>
-        <w:rPr>
-          <w:i/>
-          <w:sz w:val="22"/>
-          <w:szCs w:val="22"/>
-        </w:rPr>
-        <w:t>R</w:t>
-      </w:r>
-      <w:r>
-        <w:rPr>
-          <w:i/>
-          <w:sz w:val="22"/>
-          <w:szCs w:val="22"/>
-        </w:rPr>
-        <w:t xml:space="preserve">epo, NextAuth.js, Tailwind CSS </w:t>
+        <w:t>Next.js, Node.js, TypeScript, @solana/web3.js</w:t>
       </w:r>
     </w:p>
     <w:p>
@@ -1704,7 +1557,7 @@
           <w:sz w:val="22"/>
           <w:szCs w:val="22"/>
         </w:rPr>
-        <w:t>Built ACID-safe wallet transactions using PostgreSQL + Prisma</w:t>
+        <w:t xml:space="preserve">Built a full-stack developer sandbox for interacting with the Solana blockchain with non-custodial wallet-based transactions  </w:t>
       </w:r>
     </w:p>
     <w:p>
@@ -1725,7 +1578,14 @@
           <w:sz w:val="22"/>
           <w:szCs w:val="22"/>
         </w:rPr>
-        <w:t>Implemented P2P transfers and async bank webhook processing</w:t>
+        <w:t xml:space="preserve">Implemented SOL transfers, airdrops, and SPL token minting using @solana/web3.js  </w:t>
+      </w:r>
+      <w:r>
+        <w:rPr>
+          <w:sz w:val="22"/>
+          <w:szCs w:val="22"/>
+        </w:rPr>
+        <w:t>+ ATA Derivation</w:t>
       </w:r>
     </w:p>
     <w:p>
@@ -1736,43 +1596,56 @@
       <w:r>
         <w:rPr>
           <w:b/>
+          <w:bCs/>
+          <w:color w:val="000000"/>
           <w:u w:val="single"/>
         </w:rPr>
-        <w:t>CMS — EV Charging Management Toolkit</w:t>
-      </w:r>
-      <w:r>
-        <w:rPr>
-          <w:b/>
+        <w:t>CMS</w:t>
+      </w:r>
+      <w:r>
+        <w:rPr>
+          <w:b/>
+          <w:bCs/>
+          <w:color w:val="000000"/>
         </w:rPr>
         <w:t xml:space="preserve"> </w:t>
       </w:r>
       <w:r>
         <w:rPr>
           <w:b/>
+          <w:bCs/>
+          <w:color w:val="000000"/>
+        </w:rPr>
+        <w:t xml:space="preserve"> </w:t>
+      </w:r>
+      <w:r>
+        <w:rPr>
+          <w:b/>
+          <w:bCs/>
+          <w:color w:val="000000"/>
+        </w:rPr>
+        <w:t>— EV Charging Management Toolkit</w:t>
+      </w:r>
+      <w:r>
+        <w:rPr>
+          <w:b/>
+        </w:rPr>
+        <w:t xml:space="preserve"> </w:t>
+      </w:r>
+      <w:r>
+        <w:rPr>
+          <w:b/>
         </w:rPr>
         <w:t>|</w:t>
       </w:r>
-      <w:r>
-        <w:fldChar w:fldCharType="begin"/>
-      </w:r>
-      <w:r>
-        <w:instrText>HYPERLINK "https://neelusolarenergy.netlify.app/" \h</w:instrText>
-      </w:r>
-      <w:r>
-        <w:fldChar w:fldCharType="separate"/>
-      </w:r>
-      <w:r>
-        <w:rPr>
-          <w:sz w:val="32"/>
-        </w:rPr>
-        <w:t xml:space="preserve"> </w:t>
-      </w:r>
-      <w:r>
-        <w:rPr>
-          <w:sz w:val="32"/>
-        </w:rPr>
-        <w:fldChar w:fldCharType="end"/>
-      </w:r>
+      <w:hyperlink r:id="rId19">
+        <w:r>
+          <w:rPr>
+            <w:sz w:val="32"/>
+          </w:rPr>
+          <w:t xml:space="preserve"> </w:t>
+        </w:r>
+      </w:hyperlink>
       <w:r>
         <w:rPr>
           <w:rStyle w:val="Hyperlink"/>
@@ -1784,7 +1657,7 @@
         </w:rPr>
         <w:t>https://cms-snowy-beta.vercel.app</w:t>
       </w:r>
-      <w:hyperlink r:id="rId24">
+      <w:hyperlink r:id="rId20">
         <w:r>
           <w:rPr>
             <w:color w:val="0000FF"/>

</xml_diff>